<commit_message>
docs: Update all documentation to v1.0.1 with new feature content
</commit_message>
<xml_diff>
--- a/docs/Demo Documents/Thina_CRM_Demo_Guide.docx
+++ b/docs/Demo Documents/Thina_CRM_Demo_Guide.docx
@@ -66,7 +66,7 @@
           <w:sz w:val="28"/>
           <w:szCs w:val="28"/>
         </w:rPr>
-        <w:t xml:space="preserve">Version 1.0.0</w:t>
+        <w:t xml:space="preserve">Version 1.0.1</w:t>
       </w:r>
     </w:p>
     <w:p>
@@ -6457,7 +6457,7 @@
           <w:sz w:val="22"/>
           <w:szCs w:val="22"/>
         </w:rPr>
-        <w:t xml:space="preserve">This demo guide covers Thina CRM v0.12.0. Update talking points as new features are added.</w:t>
+        <w:t xml:space="preserve">This demo guide covers Thina CRM v1.0.1. Update talking points as new features are added.</w:t>
       </w:r>
     </w:p>
     <w:p>
@@ -7391,6 +7391,306 @@
     </w:p>
     <w:p>
       <w:pPr>
+        <w:pStyle w:val="Heading1"/>
+        <w:spacing w:after="120" w:before="300"/>
+      </w:pPr>
+      <w:r>
+        <w:t xml:space="preserve">v1.0.1 — New Demo Talking Points</w:t>
+      </w:r>
+    </w:p>
+    <w:p>
+      <w:pPr>
+        <w:spacing w:after="100"/>
+      </w:pPr>
+      <w:r>
+        <w:rPr>
+          <w:rFonts w:ascii="Aptos" w:cs="Aptos" w:eastAsia="Aptos" w:hAnsi="Aptos"/>
+          <w:sz w:val="22"/>
+          <w:szCs w:val="22"/>
+        </w:rPr>
+        <w:t xml:space="preserve">The following features are new in v1.0.1. Add these to your demo flow.</w:t>
+      </w:r>
+    </w:p>
+    <w:p>
+      <w:pPr>
+        <w:pStyle w:val="Heading2"/>
+        <w:spacing w:after="120" w:before="300"/>
+      </w:pPr>
+      <w:r>
+        <w:t xml:space="preserve">Agent Assignment Badge</w:t>
+      </w:r>
+    </w:p>
+    <w:p>
+      <w:pPr>
+        <w:spacing w:after="100"/>
+      </w:pPr>
+      <w:r>
+        <w:rPr>
+          <w:rFonts w:ascii="Aptos" w:cs="Aptos" w:eastAsia="Aptos" w:hAnsi="Aptos"/>
+          <w:sz w:val="22"/>
+          <w:szCs w:val="22"/>
+        </w:rPr>
+        <w:t xml:space="preserve">Show the agent badge on any lead or contact card. Say: 'Every lead is automatically assigned to the agent who first engages. This ensures accountability — no leads fall through the cracks.'</w:t>
+      </w:r>
+    </w:p>
+    <w:p>
+      <w:pPr>
+        <w:pStyle w:val="Heading2"/>
+        <w:spacing w:after="120" w:before="300"/>
+      </w:pPr>
+      <w:r>
+        <w:t xml:space="preserve">Real SMS Sending</w:t>
+      </w:r>
+    </w:p>
+    <w:p>
+      <w:pPr>
+        <w:spacing w:after="100"/>
+      </w:pPr>
+      <w:r>
+        <w:rPr>
+          <w:rFonts w:ascii="Aptos" w:cs="Aptos" w:eastAsia="Aptos" w:hAnsi="Aptos"/>
+          <w:sz w:val="22"/>
+          <w:szCs w:val="22"/>
+        </w:rPr>
+        <w:t xml:space="preserve">Navigate to Messaging and compose a real SMS. Say: 'Thina integrates directly with BulkSMS.co.za, South Africa's leading SMS gateway. Agents can send SMS from the CRM and track delivery status in real time.'</w:t>
+      </w:r>
+    </w:p>
+    <w:p>
+      <w:pPr>
+        <w:pStyle w:val="ListParagraph"/>
+        <w:numPr>
+          <w:ilvl w:val="0"/>
+          <w:numId w:val="1"/>
+        </w:numPr>
+        <w:spacing w:after="40"/>
+      </w:pPr>
+      <w:r>
+        <w:rPr>
+          <w:rFonts w:ascii="Aptos" w:cs="Aptos" w:eastAsia="Aptos" w:hAnsi="Aptos"/>
+          <w:sz w:val="22"/>
+          <w:szCs w:val="22"/>
+        </w:rPr>
+        <w:t xml:space="preserve">Tip: For a live demo, send a test SMS to your own phone and show the delivery confirmation.</w:t>
+      </w:r>
+    </w:p>
+    <w:p>
+      <w:pPr>
+        <w:pStyle w:val="Heading2"/>
+        <w:spacing w:after="120" w:before="300"/>
+      </w:pPr>
+      <w:r>
+        <w:t xml:space="preserve">Document Upload</w:t>
+      </w:r>
+    </w:p>
+    <w:p>
+      <w:pPr>
+        <w:spacing w:after="100"/>
+      </w:pPr>
+      <w:r>
+        <w:rPr>
+          <w:rFonts w:ascii="Aptos" w:cs="Aptos" w:eastAsia="Aptos" w:hAnsi="Aptos"/>
+          <w:sz w:val="22"/>
+          <w:szCs w:val="22"/>
+        </w:rPr>
+        <w:t xml:space="preserve">Navigate to Documents and show the upload flow. Say: 'All transaction documents — FICA, OTPs, mandates, bond applications — can be uploaded and categorised directly in the CRM. Files are stored securely in Firebase Storage with per-agent access control.'</w:t>
+      </w:r>
+    </w:p>
+    <w:p>
+      <w:pPr>
+        <w:pStyle w:val="Heading2"/>
+        <w:spacing w:after="120" w:before="300"/>
+      </w:pPr>
+      <w:r>
+        <w:t xml:space="preserve">Pipeline Click-Through</w:t>
+      </w:r>
+    </w:p>
+    <w:p>
+      <w:pPr>
+        <w:spacing w:after="100"/>
+      </w:pPr>
+      <w:r>
+        <w:rPr>
+          <w:rFonts w:ascii="Aptos" w:cs="Aptos" w:eastAsia="Aptos" w:hAnsi="Aptos"/>
+          <w:sz w:val="22"/>
+          <w:szCs w:val="22"/>
+        </w:rPr>
+        <w:t xml:space="preserve">On the Pipeline Board, click a lead card to navigate to the detail page. Say: 'Agents can click any card on the pipeline board to jump straight to the detail page. No more searching — one click from overview to action.'</w:t>
+      </w:r>
+    </w:p>
+    <w:p>
+      <w:pPr>
+        <w:pStyle w:val="Heading2"/>
+        <w:spacing w:after="120" w:before="300"/>
+      </w:pPr>
+      <w:r>
+        <w:t xml:space="preserve">Inbound Webhook</w:t>
+      </w:r>
+    </w:p>
+    <w:p>
+      <w:pPr>
+        <w:spacing w:after="100"/>
+      </w:pPr>
+      <w:r>
+        <w:rPr>
+          <w:rFonts w:ascii="Aptos" w:cs="Aptos" w:eastAsia="Aptos" w:hAnsi="Aptos"/>
+          <w:sz w:val="22"/>
+          <w:szCs w:val="22"/>
+        </w:rPr>
+        <w:t xml:space="preserve">If demoing to a technical audience, mention: 'Property24 and Private Property leads can now be injected automatically via a secure webhook with HMAC-SHA256 verification. Leads appear in the Inbound queue within seconds of the portal notification.'</w:t>
+      </w:r>
+    </w:p>
+    <w:p>
+      <w:pPr>
+        <w:pStyle w:val="Heading1"/>
+        <w:spacing w:after="120" w:before="300"/>
+      </w:pPr>
+      <w:r>
+        <w:t xml:space="preserve">v1.0.1 — New Demo Talking Points</w:t>
+      </w:r>
+    </w:p>
+    <w:p>
+      <w:pPr>
+        <w:spacing w:after="100"/>
+      </w:pPr>
+      <w:r>
+        <w:rPr>
+          <w:rFonts w:ascii="Aptos" w:cs="Aptos" w:eastAsia="Aptos" w:hAnsi="Aptos"/>
+          <w:sz w:val="22"/>
+          <w:szCs w:val="22"/>
+        </w:rPr>
+        <w:t xml:space="preserve">The following features are new in v1.0.1. Add these to your demo flow.</w:t>
+      </w:r>
+    </w:p>
+    <w:p>
+      <w:pPr>
+        <w:pStyle w:val="Heading2"/>
+        <w:spacing w:after="120" w:before="300"/>
+      </w:pPr>
+      <w:r>
+        <w:t xml:space="preserve">Agent Assignment Badge</w:t>
+      </w:r>
+    </w:p>
+    <w:p>
+      <w:pPr>
+        <w:spacing w:after="100"/>
+      </w:pPr>
+      <w:r>
+        <w:rPr>
+          <w:rFonts w:ascii="Aptos" w:cs="Aptos" w:eastAsia="Aptos" w:hAnsi="Aptos"/>
+          <w:sz w:val="22"/>
+          <w:szCs w:val="22"/>
+        </w:rPr>
+        <w:t xml:space="preserve">Show the agent badge on any lead or contact card. Say: 'Every lead is automatically assigned to the agent who first engages. This ensures accountability — no leads fall through the cracks.'</w:t>
+      </w:r>
+    </w:p>
+    <w:p>
+      <w:pPr>
+        <w:pStyle w:val="Heading2"/>
+        <w:spacing w:after="120" w:before="300"/>
+      </w:pPr>
+      <w:r>
+        <w:t xml:space="preserve">Real SMS Sending</w:t>
+      </w:r>
+    </w:p>
+    <w:p>
+      <w:pPr>
+        <w:spacing w:after="100"/>
+      </w:pPr>
+      <w:r>
+        <w:rPr>
+          <w:rFonts w:ascii="Aptos" w:cs="Aptos" w:eastAsia="Aptos" w:hAnsi="Aptos"/>
+          <w:sz w:val="22"/>
+          <w:szCs w:val="22"/>
+        </w:rPr>
+        <w:t xml:space="preserve">Navigate to Messaging and compose a real SMS. Say: 'Thina integrates directly with BulkSMS.co.za, South Africa's leading SMS gateway. Agents can send SMS from the CRM and track delivery status in real time.'</w:t>
+      </w:r>
+    </w:p>
+    <w:p>
+      <w:pPr>
+        <w:pStyle w:val="ListParagraph"/>
+        <w:numPr>
+          <w:ilvl w:val="0"/>
+          <w:numId w:val="1"/>
+        </w:numPr>
+        <w:spacing w:after="40"/>
+      </w:pPr>
+      <w:r>
+        <w:rPr>
+          <w:rFonts w:ascii="Aptos" w:cs="Aptos" w:eastAsia="Aptos" w:hAnsi="Aptos"/>
+          <w:sz w:val="22"/>
+          <w:szCs w:val="22"/>
+        </w:rPr>
+        <w:t xml:space="preserve">Tip: For a live demo, send a test SMS to your own phone and show the delivery confirmation.</w:t>
+      </w:r>
+    </w:p>
+    <w:p>
+      <w:pPr>
+        <w:pStyle w:val="Heading2"/>
+        <w:spacing w:after="120" w:before="300"/>
+      </w:pPr>
+      <w:r>
+        <w:t xml:space="preserve">Document Upload</w:t>
+      </w:r>
+    </w:p>
+    <w:p>
+      <w:pPr>
+        <w:spacing w:after="100"/>
+      </w:pPr>
+      <w:r>
+        <w:rPr>
+          <w:rFonts w:ascii="Aptos" w:cs="Aptos" w:eastAsia="Aptos" w:hAnsi="Aptos"/>
+          <w:sz w:val="22"/>
+          <w:szCs w:val="22"/>
+        </w:rPr>
+        <w:t xml:space="preserve">Navigate to Documents and show the upload flow. Say: 'All transaction documents — FICA, OTPs, mandates, bond applications — can be uploaded and categorised directly in the CRM. Files are stored securely in Firebase Storage with per-agent access control.'</w:t>
+      </w:r>
+    </w:p>
+    <w:p>
+      <w:pPr>
+        <w:pStyle w:val="Heading2"/>
+        <w:spacing w:after="120" w:before="300"/>
+      </w:pPr>
+      <w:r>
+        <w:t xml:space="preserve">Pipeline Click-Through</w:t>
+      </w:r>
+    </w:p>
+    <w:p>
+      <w:pPr>
+        <w:spacing w:after="100"/>
+      </w:pPr>
+      <w:r>
+        <w:rPr>
+          <w:rFonts w:ascii="Aptos" w:cs="Aptos" w:eastAsia="Aptos" w:hAnsi="Aptos"/>
+          <w:sz w:val="22"/>
+          <w:szCs w:val="22"/>
+        </w:rPr>
+        <w:t xml:space="preserve">On the Pipeline Board, click a lead card to navigate to the detail page. Say: 'Agents can click any card on the pipeline board to jump straight to the detail page. No more searching — one click from overview to action.'</w:t>
+      </w:r>
+    </w:p>
+    <w:p>
+      <w:pPr>
+        <w:pStyle w:val="Heading2"/>
+        <w:spacing w:after="120" w:before="300"/>
+      </w:pPr>
+      <w:r>
+        <w:t xml:space="preserve">Inbound Webhook</w:t>
+      </w:r>
+    </w:p>
+    <w:p>
+      <w:pPr>
+        <w:spacing w:after="100"/>
+      </w:pPr>
+      <w:r>
+        <w:rPr>
+          <w:rFonts w:ascii="Aptos" w:cs="Aptos" w:eastAsia="Aptos" w:hAnsi="Aptos"/>
+          <w:sz w:val="22"/>
+          <w:szCs w:val="22"/>
+        </w:rPr>
+        <w:t xml:space="preserve">If demoing to a technical audience, mention: 'Property24 and Private Property leads can now be injected automatically via a secure webhook with HMAC-SHA256 verification. Leads appear in the Inbound queue within seconds of the portal notification.'</w:t>
+      </w:r>
+    </w:p>
+    <w:p>
+      <w:pPr>
         <w:spacing w:after="40"/>
       </w:pPr>
     </w:p>
@@ -7428,7 +7728,7 @@
           <w:sz w:val="18"/>
           <w:szCs w:val="18"/>
         </w:rPr>
-        <w:t xml:space="preserve">Thina CRM v1.0.0 • Generated 20 April 2026</w:t>
+        <w:t xml:space="preserve">Thina CRM v1.0.1 • Generated 20 April 2026</w:t>
       </w:r>
     </w:p>
     <w:sectPr>

</xml_diff>

<commit_message>
docs: regenerate all docs with v1.3.6 features (Agent Profile, address autocomplete, CMA redesign, security 9.0/10)
</commit_message>
<xml_diff>
--- a/docs/Demo Documents/Thina_CRM_Demo_Guide.docx
+++ b/docs/Demo Documents/Thina_CRM_Demo_Guide.docx
@@ -66,7 +66,7 @@
           <w:sz w:val="28"/>
           <w:szCs w:val="28"/>
         </w:rPr>
-        <w:t xml:space="preserve">Version 1.1.0</w:t>
+        <w:t xml:space="preserve">Version 1.3.6</w:t>
       </w:r>
     </w:p>
     <w:p>
@@ -81,7 +81,7 @@
           <w:sz w:val="24"/>
           <w:szCs w:val="24"/>
         </w:rPr>
-        <w:t xml:space="preserve">20 April 2026</w:t>
+        <w:t xml:space="preserve">26 April 2026</w:t>
       </w:r>
     </w:p>
     <w:p>
@@ -408,6 +408,143 @@
     </w:p>
     <w:p>
       <w:pPr>
+        <w:pStyle w:val="Heading1"/>
+        <w:spacing w:after="120" w:before="300"/>
+      </w:pPr>
+      <w:r>
+        <w:t xml:space="preserve">v1.3.x — New Demo Talking Points</w:t>
+      </w:r>
+    </w:p>
+    <w:p>
+      <w:pPr>
+        <w:pStyle w:val="Heading2"/>
+        <w:spacing w:after="120" w:before="300"/>
+      </w:pPr>
+      <w:r>
+        <w:t xml:space="preserve">Agent Profile &amp; Branded CMAs (v1.3.6)</w:t>
+      </w:r>
+    </w:p>
+    <w:p>
+      <w:pPr>
+        <w:spacing w:after="100"/>
+      </w:pPr>
+      <w:r>
+        <w:rPr>
+          <w:rFonts w:ascii="Aptos" w:cs="Aptos" w:eastAsia="Aptos" w:hAnsi="Aptos"/>
+          <w:sz w:val="22"/>
+          <w:szCs w:val="22"/>
+        </w:rPr>
+        <w:t xml:space="preserve">Open Settings → Agent Profile and show the form (photo + agency logo + FFC#). Then download any CMA PDF and flip to the cover and the last page. Say: 'Every agent has their own branded profile — photo, agency logo, FFC number, contact details. It flows automatically onto every CMA we produce. And because we snapshot the agent's details onto each saved report, historical CMAs always show the correct preparer — even if the agent later updates their profile or leaves.'</w:t>
+      </w:r>
+    </w:p>
+    <w:p>
+      <w:pPr>
+        <w:pStyle w:val="ListParagraph"/>
+        <w:numPr>
+          <w:ilvl w:val="0"/>
+          <w:numId w:val="1"/>
+        </w:numPr>
+        <w:spacing w:after="40"/>
+      </w:pPr>
+      <w:r>
+        <w:rPr>
+          <w:rFonts w:ascii="Aptos" w:cs="Aptos" w:eastAsia="Aptos" w:hAnsi="Aptos"/>
+          <w:sz w:val="22"/>
+          <w:szCs w:val="22"/>
+        </w:rPr>
+        <w:t xml:space="preserve">Tip: have a demo agent profile fully populated before the demo so the PDF looks polished.</w:t>
+      </w:r>
+    </w:p>
+    <w:p>
+      <w:pPr>
+        <w:pStyle w:val="Heading2"/>
+        <w:spacing w:after="120" w:before="300"/>
+      </w:pPr>
+      <w:r>
+        <w:t xml:space="preserve">Address Autocomplete (v1.3.4)</w:t>
+      </w:r>
+    </w:p>
+    <w:p>
+      <w:pPr>
+        <w:spacing w:after="100"/>
+      </w:pPr>
+      <w:r>
+        <w:rPr>
+          <w:rFonts w:ascii="Aptos" w:cs="Aptos" w:eastAsia="Aptos" w:hAnsi="Aptos"/>
+          <w:sz w:val="22"/>
+          <w:szCs w:val="22"/>
+        </w:rPr>
+        <w:t xml:space="preserve">On the Properties form or the CMA form, type a partial address and pick from the dropdown. Say: 'We use Google Places autocomplete restricted to South Africa, and we capture the exact GPS coordinates. For CMAs, those coordinates are passed to the AI so the comparables it researches are properly local — not just based on a typed suburb name.'</w:t>
+      </w:r>
+    </w:p>
+    <w:p>
+      <w:pPr>
+        <w:pStyle w:val="Heading2"/>
+        <w:spacing w:after="120" w:before="300"/>
+      </w:pPr>
+      <w:r>
+        <w:t xml:space="preserve">The New CMA PDF (v1.3.5)</w:t>
+      </w:r>
+    </w:p>
+    <w:p>
+      <w:pPr>
+        <w:spacing w:after="100"/>
+      </w:pPr>
+      <w:r>
+        <w:rPr>
+          <w:rFonts w:ascii="Aptos" w:cs="Aptos" w:eastAsia="Aptos" w:hAnsi="Aptos"/>
+          <w:sz w:val="22"/>
+          <w:szCs w:val="22"/>
+        </w:rPr>
+        <w:t xml:space="preserve">Open any CMA report and click 'Download PDF'. Walk through it page by page: cover, executive summary with KPI tiles and value-range bar, subject tearsheet, per-comparable detailed cards, comparison matrix, price distribution chart, three-tier pricing strategy, agent contact card. Say: 'This output is the equal of anything the major franchises produce — it gives our agents a real edge in winning mandates.'</w:t>
+      </w:r>
+    </w:p>
+    <w:p>
+      <w:pPr>
+        <w:pStyle w:val="Heading2"/>
+        <w:spacing w:after="120" w:before="300"/>
+      </w:pPr>
+      <w:r>
+        <w:t xml:space="preserve">Enterprise-Grade Security (v1.3.5)</w:t>
+      </w:r>
+    </w:p>
+    <w:p>
+      <w:pPr>
+        <w:spacing w:after="100"/>
+      </w:pPr>
+      <w:r>
+        <w:rPr>
+          <w:rFonts w:ascii="Aptos" w:cs="Aptos" w:eastAsia="Aptos" w:hAnsi="Aptos"/>
+          <w:sz w:val="22"/>
+          <w:szCs w:val="22"/>
+        </w:rPr>
+        <w:t xml:space="preserve">For technical / IT-buyer audiences, mention: 'We've completed a full security sprint — distributed Firestore-backed rate limiting that scales across all instances, Content-Security-Policy in enforcing mode, HMAC-signed webhooks, and full Sentry observability. The independent audit rates us at 9.0 out of 10.'</w:t>
+      </w:r>
+    </w:p>
+    <w:p>
+      <w:pPr>
+        <w:pStyle w:val="Heading2"/>
+        <w:spacing w:after="120" w:before="300"/>
+      </w:pPr>
+      <w:r>
+        <w:t xml:space="preserve">AI-Grounded CMA Research</w:t>
+      </w:r>
+    </w:p>
+    <w:p>
+      <w:pPr>
+        <w:spacing w:after="100"/>
+      </w:pPr>
+      <w:r>
+        <w:rPr>
+          <w:rFonts w:ascii="Aptos" w:cs="Aptos" w:eastAsia="Aptos" w:hAnsi="Aptos"/>
+          <w:sz w:val="22"/>
+          <w:szCs w:val="22"/>
+        </w:rPr>
+        <w:t xml:space="preserve">On the CMA page, click 'Research with Gemini'. Say: 'We use Google Gemini with live Search grounding, and now the AI is anchored on the exact GPS coordinates of the subject property — so the comparables it surfaces are genuinely nearby and recent.'</w:t>
+      </w:r>
+    </w:p>
+    <w:p>
+      <w:pPr>
         <w:spacing w:after="40"/>
       </w:pPr>
     </w:p>
@@ -445,7 +582,7 @@
           <w:sz w:val="18"/>
           <w:szCs w:val="18"/>
         </w:rPr>
-        <w:t xml:space="preserve">Thina CRM v1.1.0 • Generated 20 April 2026</w:t>
+        <w:t xml:space="preserve">Thina CRM v1.3.6 • Generated 26 April 2026</w:t>
       </w:r>
     </w:p>
     <w:sectPr>
@@ -890,10 +1027,4 @@
     </w:rPr>
   </w:style>
 </w:styles>
-</file>
-
-<file path=docMetadata/LabelInfo.xml><?xml version="1.0" encoding="utf-8"?>
-<clbl:labelList xmlns:clbl="http://schemas.microsoft.com/office/2020/mipLabelMetadata">
-  <clbl:label id="{f42aa342-8706-4288-bd11-ebb85995028c}" enabled="1" method="Privileged" siteId="{72f988bf-86f1-41af-91ab-2d7cd011db47}" contentBits="0" removed="0"/>
-</clbl:labelList>
 </file>
</xml_diff>